<commit_message>
updates to tech architecture
</commit_message>
<xml_diff>
--- a/docs/design/Analekh - Technical Design v0.0.4.docx
+++ b/docs/design/Analekh - Technical Design v0.0.4.docx
@@ -8392,7 +8392,7 @@
         <w:t xml:space="preserve">What is stored.</w:t>
       </w:r>
       <w:r>
-        <w:t xml:space="preserve"> For each company the file matches by ISIN: trade date, open, high, low, close, previous close and volume, and a market cap: the close times the shares in issue, worked out from the latest results filing (paid-up equity capital divided by face value). On 16 October 2026, 3,044 companies matched and 2,596 had a share count; Reliance came to Rs 16,39,117 crore.</w:t>
+        <w:t xml:space="preserve"> For each company the file matches by ISIN: trade date, open, high, low, close, previous close and volume, and a market cap: the close times the shares in issue, worked out as paid-up equity capital from the results filings divided by the face value in NSE's equity list. Filed face values are unreliable (tagged as 0, as the capital itself, or from before a split), and some filers tag paid-up capital 1,000 to 1,00,000 times too large, so: when the latest quarter and the one before differ by more than 50 times, the smaller is used; capital above 100 times total assets is ignored (Ind-AS and banks); a market cap above Rs 30 lakh crore is not shown. The results watcher recomputes market caps when new filings arrive (analekh prices --recompute does it by hand). On 16 October 2026, 3,044 companies matched and 2,624 had a market cap; Reliance came to Rs 16,39,117 crore.</w:t>
       </w:r>
     </w:p>
     <w:p>
@@ -9102,7 +9102,7 @@
               <a:graphicData uri="http://schemas.openxmlformats.org/drawingml/2006/picture">
                 <pic:pic>
                   <pic:nvPicPr>
-                    <pic:cNvPr id="0" name="panel1.png"/>
+                    <pic:cNvPr id="0" name="image.png"/>
                     <pic:cNvPicPr/>
                   </pic:nvPicPr>
                   <pic:blipFill>
@@ -11746,7 +11746,7 @@
               <a:graphicData uri="http://schemas.openxmlformats.org/drawingml/2006/picture">
                 <pic:pic>
                   <pic:nvPicPr>
-                    <pic:cNvPr id="0" name="panel2.png"/>
+                    <pic:cNvPr id="0" name="image.png"/>
                     <pic:cNvPicPr/>
                   </pic:nvPicPr>
                   <pic:blipFill>
@@ -11800,7 +11800,7 @@
         <w:pStyle w:val="ListParagraph"/>
         <w:numPr>
           <w:ilvl w:val="0"/>
-          <w:numId w:val="11"/>
+          <w:numId w:val="20"/>
         </w:numPr>
         <w:spacing w:after="60"/>
       </w:pPr>
@@ -11820,7 +11820,7 @@
         <w:pStyle w:val="ListParagraph"/>
         <w:numPr>
           <w:ilvl w:val="0"/>
-          <w:numId w:val="11"/>
+          <w:numId w:val="20"/>
         </w:numPr>
         <w:spacing w:after="60"/>
       </w:pPr>
@@ -11840,7 +11840,7 @@
         <w:pStyle w:val="ListParagraph"/>
         <w:numPr>
           <w:ilvl w:val="0"/>
-          <w:numId w:val="11"/>
+          <w:numId w:val="20"/>
         </w:numPr>
         <w:spacing w:after="60"/>
       </w:pPr>
@@ -11860,7 +11860,7 @@
         <w:pStyle w:val="ListParagraph"/>
         <w:numPr>
           <w:ilvl w:val="0"/>
-          <w:numId w:val="11"/>
+          <w:numId w:val="20"/>
         </w:numPr>
         <w:spacing w:after="60"/>
       </w:pPr>
@@ -11880,7 +11880,7 @@
         <w:pStyle w:val="ListParagraph"/>
         <w:numPr>
           <w:ilvl w:val="0"/>
-          <w:numId w:val="11"/>
+          <w:numId w:val="20"/>
         </w:numPr>
         <w:spacing w:after="60"/>
       </w:pPr>
@@ -11900,7 +11900,7 @@
         <w:pStyle w:val="ListParagraph"/>
         <w:numPr>
           <w:ilvl w:val="0"/>
-          <w:numId w:val="11"/>
+          <w:numId w:val="20"/>
         </w:numPr>
         <w:spacing w:after="60"/>
       </w:pPr>
@@ -11920,7 +11920,7 @@
         <w:pStyle w:val="ListParagraph"/>
         <w:numPr>
           <w:ilvl w:val="0"/>
-          <w:numId w:val="11"/>
+          <w:numId w:val="20"/>
         </w:numPr>
         <w:spacing w:after="60"/>
       </w:pPr>
@@ -11940,7 +11940,7 @@
         <w:pStyle w:val="ListParagraph"/>
         <w:numPr>
           <w:ilvl w:val="0"/>
-          <w:numId w:val="11"/>
+          <w:numId w:val="20"/>
         </w:numPr>
         <w:spacing w:after="60"/>
       </w:pPr>
@@ -11960,7 +11960,7 @@
         <w:pStyle w:val="ListParagraph"/>
         <w:numPr>
           <w:ilvl w:val="0"/>
-          <w:numId w:val="11"/>
+          <w:numId w:val="20"/>
         </w:numPr>
         <w:spacing w:after="60"/>
       </w:pPr>
@@ -11980,7 +11980,7 @@
         <w:pStyle w:val="ListParagraph"/>
         <w:numPr>
           <w:ilvl w:val="0"/>
-          <w:numId w:val="11"/>
+          <w:numId w:val="20"/>
         </w:numPr>
         <w:spacing w:after="60"/>
       </w:pPr>
@@ -12035,7 +12035,7 @@
               <a:graphicData uri="http://schemas.openxmlformats.org/drawingml/2006/picture">
                 <pic:pic>
                   <pic:nvPicPr>
-                    <pic:cNvPr id="0" name="panel3.png"/>
+                    <pic:cNvPr id="0" name="image.png"/>
                     <pic:cNvPicPr/>
                   </pic:nvPicPr>
                   <pic:blipFill>
@@ -12089,7 +12089,7 @@
         <w:pStyle w:val="ListParagraph"/>
         <w:numPr>
           <w:ilvl w:val="0"/>
-          <w:numId w:val="12"/>
+          <w:numId w:val="21"/>
         </w:numPr>
         <w:spacing w:after="60"/>
       </w:pPr>
@@ -12109,7 +12109,7 @@
         <w:pStyle w:val="ListParagraph"/>
         <w:numPr>
           <w:ilvl w:val="0"/>
-          <w:numId w:val="12"/>
+          <w:numId w:val="21"/>
         </w:numPr>
         <w:spacing w:after="60"/>
       </w:pPr>
@@ -12129,7 +12129,7 @@
         <w:pStyle w:val="ListParagraph"/>
         <w:numPr>
           <w:ilvl w:val="0"/>
-          <w:numId w:val="12"/>
+          <w:numId w:val="21"/>
         </w:numPr>
         <w:spacing w:after="60"/>
       </w:pPr>
@@ -12149,7 +12149,7 @@
         <w:pStyle w:val="ListParagraph"/>
         <w:numPr>
           <w:ilvl w:val="0"/>
-          <w:numId w:val="12"/>
+          <w:numId w:val="21"/>
         </w:numPr>
         <w:spacing w:after="60"/>
       </w:pPr>
@@ -12169,7 +12169,7 @@
         <w:pStyle w:val="ListParagraph"/>
         <w:numPr>
           <w:ilvl w:val="0"/>
-          <w:numId w:val="12"/>
+          <w:numId w:val="21"/>
         </w:numPr>
         <w:spacing w:after="60"/>
       </w:pPr>
@@ -12189,7 +12189,7 @@
         <w:pStyle w:val="ListParagraph"/>
         <w:numPr>
           <w:ilvl w:val="0"/>
-          <w:numId w:val="12"/>
+          <w:numId w:val="21"/>
         </w:numPr>
         <w:spacing w:after="60"/>
       </w:pPr>
@@ -12201,7 +12201,7 @@
         <w:t xml:space="preserve">Companies are matched by ISIN</w:t>
       </w:r>
       <w:r>
-        <w:t xml:space="preserve">; shares in issue come from the latest results filing (paid-up equity capital divided by face value) and market cap is the close times the shares.</w:t>
+        <w:t xml:space="preserve">; shares in issue are paid-up equity capital from the results filings divided by the face value in NSE's equity list (with the guards above) and market cap is the close times the shares.</w:t>
       </w:r>
     </w:p>
     <w:p>
@@ -12209,7 +12209,7 @@
         <w:pStyle w:val="ListParagraph"/>
         <w:numPr>
           <w:ilvl w:val="0"/>
-          <w:numId w:val="12"/>
+          <w:numId w:val="21"/>
         </w:numPr>
         <w:spacing w:after="60"/>
       </w:pPr>
@@ -12229,7 +12229,7 @@
         <w:pStyle w:val="ListParagraph"/>
         <w:numPr>
           <w:ilvl w:val="0"/>
-          <w:numId w:val="12"/>
+          <w:numId w:val="21"/>
         </w:numPr>
         <w:spacing w:after="60"/>
       </w:pPr>
@@ -12284,7 +12284,7 @@
               <a:graphicData uri="http://schemas.openxmlformats.org/drawingml/2006/picture">
                 <pic:pic>
                   <pic:nvPicPr>
-                    <pic:cNvPr id="0" name="panel4.png"/>
+                    <pic:cNvPr id="0" name="image.png"/>
                     <pic:cNvPicPr/>
                   </pic:nvPicPr>
                   <pic:blipFill>
@@ -12338,7 +12338,7 @@
         <w:pStyle w:val="ListParagraph"/>
         <w:numPr>
           <w:ilvl w:val="0"/>
-          <w:numId w:val="13"/>
+          <w:numId w:val="22"/>
         </w:numPr>
         <w:spacing w:after="60"/>
       </w:pPr>
@@ -12358,7 +12358,7 @@
         <w:pStyle w:val="ListParagraph"/>
         <w:numPr>
           <w:ilvl w:val="0"/>
-          <w:numId w:val="13"/>
+          <w:numId w:val="22"/>
         </w:numPr>
         <w:spacing w:after="60"/>
       </w:pPr>
@@ -12378,7 +12378,7 @@
         <w:pStyle w:val="ListParagraph"/>
         <w:numPr>
           <w:ilvl w:val="0"/>
-          <w:numId w:val="13"/>
+          <w:numId w:val="22"/>
         </w:numPr>
         <w:spacing w:after="60"/>
       </w:pPr>
@@ -12398,7 +12398,7 @@
         <w:pStyle w:val="ListParagraph"/>
         <w:numPr>
           <w:ilvl w:val="0"/>
-          <w:numId w:val="13"/>
+          <w:numId w:val="22"/>
         </w:numPr>
         <w:spacing w:after="60"/>
       </w:pPr>
@@ -12418,7 +12418,7 @@
         <w:pStyle w:val="ListParagraph"/>
         <w:numPr>
           <w:ilvl w:val="0"/>
-          <w:numId w:val="13"/>
+          <w:numId w:val="22"/>
         </w:numPr>
         <w:spacing w:after="60"/>
       </w:pPr>
@@ -12438,7 +12438,7 @@
         <w:pStyle w:val="ListParagraph"/>
         <w:numPr>
           <w:ilvl w:val="0"/>
-          <w:numId w:val="13"/>
+          <w:numId w:val="22"/>
         </w:numPr>
         <w:spacing w:after="60"/>
       </w:pPr>
@@ -12493,7 +12493,7 @@
               <a:graphicData uri="http://schemas.openxmlformats.org/drawingml/2006/picture">
                 <pic:pic>
                   <pic:nvPicPr>
-                    <pic:cNvPr id="0" name="panel5.png"/>
+                    <pic:cNvPr id="0" name="image.png"/>
                     <pic:cNvPicPr/>
                   </pic:nvPicPr>
                   <pic:blipFill>
@@ -12547,7 +12547,7 @@
         <w:pStyle w:val="ListParagraph"/>
         <w:numPr>
           <w:ilvl w:val="0"/>
-          <w:numId w:val="14"/>
+          <w:numId w:val="23"/>
         </w:numPr>
         <w:spacing w:after="60"/>
       </w:pPr>
@@ -12567,7 +12567,7 @@
         <w:pStyle w:val="ListParagraph"/>
         <w:numPr>
           <w:ilvl w:val="0"/>
-          <w:numId w:val="14"/>
+          <w:numId w:val="23"/>
         </w:numPr>
         <w:spacing w:after="60"/>
       </w:pPr>
@@ -12587,7 +12587,7 @@
         <w:pStyle w:val="ListParagraph"/>
         <w:numPr>
           <w:ilvl w:val="0"/>
-          <w:numId w:val="14"/>
+          <w:numId w:val="23"/>
         </w:numPr>
         <w:spacing w:after="60"/>
       </w:pPr>
@@ -12607,7 +12607,7 @@
         <w:pStyle w:val="ListParagraph"/>
         <w:numPr>
           <w:ilvl w:val="0"/>
-          <w:numId w:val="14"/>
+          <w:numId w:val="23"/>
         </w:numPr>
         <w:spacing w:after="60"/>
       </w:pPr>
@@ -12627,7 +12627,7 @@
         <w:pStyle w:val="ListParagraph"/>
         <w:numPr>
           <w:ilvl w:val="0"/>
-          <w:numId w:val="14"/>
+          <w:numId w:val="23"/>
         </w:numPr>
         <w:spacing w:after="60"/>
       </w:pPr>
@@ -12647,7 +12647,7 @@
         <w:pStyle w:val="ListParagraph"/>
         <w:numPr>
           <w:ilvl w:val="0"/>
-          <w:numId w:val="14"/>
+          <w:numId w:val="23"/>
         </w:numPr>
         <w:spacing w:after="60"/>
       </w:pPr>
@@ -12702,7 +12702,7 @@
               <a:graphicData uri="http://schemas.openxmlformats.org/drawingml/2006/picture">
                 <pic:pic>
                   <pic:nvPicPr>
-                    <pic:cNvPr id="0" name="panel6.png"/>
+                    <pic:cNvPr id="0" name="image.png"/>
                     <pic:cNvPicPr/>
                   </pic:nvPicPr>
                   <pic:blipFill>
@@ -12756,7 +12756,7 @@
         <w:pStyle w:val="ListParagraph"/>
         <w:numPr>
           <w:ilvl w:val="0"/>
-          <w:numId w:val="15"/>
+          <w:numId w:val="24"/>
         </w:numPr>
         <w:spacing w:after="60"/>
       </w:pPr>
@@ -12776,7 +12776,7 @@
         <w:pStyle w:val="ListParagraph"/>
         <w:numPr>
           <w:ilvl w:val="0"/>
-          <w:numId w:val="15"/>
+          <w:numId w:val="24"/>
         </w:numPr>
         <w:spacing w:after="60"/>
       </w:pPr>
@@ -12796,7 +12796,7 @@
         <w:pStyle w:val="ListParagraph"/>
         <w:numPr>
           <w:ilvl w:val="0"/>
-          <w:numId w:val="15"/>
+          <w:numId w:val="24"/>
         </w:numPr>
         <w:spacing w:after="60"/>
       </w:pPr>
@@ -12816,7 +12816,7 @@
         <w:pStyle w:val="ListParagraph"/>
         <w:numPr>
           <w:ilvl w:val="0"/>
-          <w:numId w:val="15"/>
+          <w:numId w:val="24"/>
         </w:numPr>
         <w:spacing w:after="60"/>
       </w:pPr>
@@ -12836,7 +12836,7 @@
         <w:pStyle w:val="ListParagraph"/>
         <w:numPr>
           <w:ilvl w:val="0"/>
-          <w:numId w:val="15"/>
+          <w:numId w:val="24"/>
         </w:numPr>
         <w:spacing w:after="60"/>
       </w:pPr>
@@ -12856,7 +12856,7 @@
         <w:pStyle w:val="ListParagraph"/>
         <w:numPr>
           <w:ilvl w:val="0"/>
-          <w:numId w:val="15"/>
+          <w:numId w:val="24"/>
         </w:numPr>
         <w:spacing w:after="60"/>
       </w:pPr>
@@ -12876,7 +12876,7 @@
         <w:pStyle w:val="ListParagraph"/>
         <w:numPr>
           <w:ilvl w:val="0"/>
-          <w:numId w:val="15"/>
+          <w:numId w:val="24"/>
         </w:numPr>
         <w:spacing w:after="60"/>
       </w:pPr>
@@ -12896,7 +12896,7 @@
         <w:pStyle w:val="ListParagraph"/>
         <w:numPr>
           <w:ilvl w:val="0"/>
-          <w:numId w:val="15"/>
+          <w:numId w:val="24"/>
         </w:numPr>
         <w:spacing w:after="60"/>
       </w:pPr>
@@ -12916,7 +12916,7 @@
         <w:pStyle w:val="ListParagraph"/>
         <w:numPr>
           <w:ilvl w:val="0"/>
-          <w:numId w:val="15"/>
+          <w:numId w:val="24"/>
         </w:numPr>
         <w:spacing w:after="60"/>
       </w:pPr>
@@ -12971,7 +12971,7 @@
               <a:graphicData uri="http://schemas.openxmlformats.org/drawingml/2006/picture">
                 <pic:pic>
                   <pic:nvPicPr>
-                    <pic:cNvPr id="0" name="panel7.png"/>
+                    <pic:cNvPr id="0" name="image.png"/>
                     <pic:cNvPicPr/>
                   </pic:nvPicPr>
                   <pic:blipFill>
@@ -13025,7 +13025,7 @@
         <w:pStyle w:val="ListParagraph"/>
         <w:numPr>
           <w:ilvl w:val="0"/>
-          <w:numId w:val="16"/>
+          <w:numId w:val="25"/>
         </w:numPr>
         <w:spacing w:after="60"/>
       </w:pPr>
@@ -13045,7 +13045,7 @@
         <w:pStyle w:val="ListParagraph"/>
         <w:numPr>
           <w:ilvl w:val="0"/>
-          <w:numId w:val="16"/>
+          <w:numId w:val="25"/>
         </w:numPr>
         <w:spacing w:after="60"/>
       </w:pPr>
@@ -13065,7 +13065,7 @@
         <w:pStyle w:val="ListParagraph"/>
         <w:numPr>
           <w:ilvl w:val="0"/>
-          <w:numId w:val="16"/>
+          <w:numId w:val="25"/>
         </w:numPr>
         <w:spacing w:after="60"/>
       </w:pPr>
@@ -13085,7 +13085,7 @@
         <w:pStyle w:val="ListParagraph"/>
         <w:numPr>
           <w:ilvl w:val="0"/>
-          <w:numId w:val="16"/>
+          <w:numId w:val="25"/>
         </w:numPr>
         <w:spacing w:after="60"/>
       </w:pPr>
@@ -13105,7 +13105,7 @@
         <w:pStyle w:val="ListParagraph"/>
         <w:numPr>
           <w:ilvl w:val="0"/>
-          <w:numId w:val="16"/>
+          <w:numId w:val="25"/>
         </w:numPr>
         <w:spacing w:after="60"/>
       </w:pPr>
@@ -13125,7 +13125,7 @@
         <w:pStyle w:val="ListParagraph"/>
         <w:numPr>
           <w:ilvl w:val="0"/>
-          <w:numId w:val="16"/>
+          <w:numId w:val="25"/>
         </w:numPr>
         <w:spacing w:after="60"/>
       </w:pPr>
@@ -13145,7 +13145,7 @@
         <w:pStyle w:val="ListParagraph"/>
         <w:numPr>
           <w:ilvl w:val="0"/>
-          <w:numId w:val="16"/>
+          <w:numId w:val="25"/>
         </w:numPr>
         <w:spacing w:after="60"/>
       </w:pPr>
@@ -13165,7 +13165,7 @@
         <w:pStyle w:val="ListParagraph"/>
         <w:numPr>
           <w:ilvl w:val="0"/>
-          <w:numId w:val="16"/>
+          <w:numId w:val="25"/>
         </w:numPr>
         <w:spacing w:after="60"/>
       </w:pPr>
@@ -13185,7 +13185,7 @@
         <w:pStyle w:val="ListParagraph"/>
         <w:numPr>
           <w:ilvl w:val="0"/>
-          <w:numId w:val="16"/>
+          <w:numId w:val="25"/>
         </w:numPr>
         <w:spacing w:after="60"/>
       </w:pPr>
@@ -13240,7 +13240,7 @@
               <a:graphicData uri="http://schemas.openxmlformats.org/drawingml/2006/picture">
                 <pic:pic>
                   <pic:nvPicPr>
-                    <pic:cNvPr id="0" name="panel8.png"/>
+                    <pic:cNvPr id="0" name="image.png"/>
                     <pic:cNvPicPr/>
                   </pic:nvPicPr>
                   <pic:blipFill>
@@ -13294,7 +13294,7 @@
         <w:pStyle w:val="ListParagraph"/>
         <w:numPr>
           <w:ilvl w:val="0"/>
-          <w:numId w:val="17"/>
+          <w:numId w:val="26"/>
         </w:numPr>
         <w:spacing w:after="60"/>
       </w:pPr>
@@ -13314,7 +13314,7 @@
         <w:pStyle w:val="ListParagraph"/>
         <w:numPr>
           <w:ilvl w:val="0"/>
-          <w:numId w:val="17"/>
+          <w:numId w:val="26"/>
         </w:numPr>
         <w:spacing w:after="60"/>
       </w:pPr>
@@ -13334,7 +13334,7 @@
         <w:pStyle w:val="ListParagraph"/>
         <w:numPr>
           <w:ilvl w:val="0"/>
-          <w:numId w:val="17"/>
+          <w:numId w:val="26"/>
         </w:numPr>
         <w:spacing w:after="60"/>
       </w:pPr>
@@ -13354,7 +13354,7 @@
         <w:pStyle w:val="ListParagraph"/>
         <w:numPr>
           <w:ilvl w:val="0"/>
-          <w:numId w:val="17"/>
+          <w:numId w:val="26"/>
         </w:numPr>
         <w:spacing w:after="60"/>
       </w:pPr>
@@ -13374,7 +13374,7 @@
         <w:pStyle w:val="ListParagraph"/>
         <w:numPr>
           <w:ilvl w:val="0"/>
-          <w:numId w:val="17"/>
+          <w:numId w:val="26"/>
         </w:numPr>
         <w:spacing w:after="60"/>
       </w:pPr>
@@ -13394,7 +13394,7 @@
         <w:pStyle w:val="ListParagraph"/>
         <w:numPr>
           <w:ilvl w:val="0"/>
-          <w:numId w:val="17"/>
+          <w:numId w:val="26"/>
         </w:numPr>
         <w:spacing w:after="60"/>
       </w:pPr>
@@ -13414,7 +13414,7 @@
         <w:pStyle w:val="ListParagraph"/>
         <w:numPr>
           <w:ilvl w:val="0"/>
-          <w:numId w:val="17"/>
+          <w:numId w:val="26"/>
         </w:numPr>
         <w:spacing w:after="60"/>
       </w:pPr>
@@ -13460,7 +13460,7 @@
       <w:r>
         <w:drawing>
           <wp:inline xmlns:a="http://schemas.openxmlformats.org/drawingml/2006/main" xmlns:pic="http://schemas.openxmlformats.org/drawingml/2006/picture">
-            <wp:extent cx="8591550" cy="3555010"/>
+            <wp:extent cx="8591550" cy="3935313"/>
             <wp:docPr id="9" name="Picture 9"/>
             <wp:cNvGraphicFramePr>
               <a:graphicFrameLocks noChangeAspect="1"/>
@@ -13473,7 +13473,7 @@
                     <pic:cNvPicPr/>
                   </pic:nvPicPr>
                   <pic:blipFill>
-                    <a:blip r:embed="rId35"/>
+                    <a:blip r:embed="rId39"/>
                     <a:stretch>
                       <a:fillRect/>
                     </a:stretch>
@@ -13481,7 +13481,7 @@
                   <pic:spPr>
                     <a:xfrm>
                       <a:off x="0" y="0"/>
-                      <a:ext cx="8591550" cy="3555010"/>
+                      <a:ext cx="8591550" cy="3935313"/>
                     </a:xfrm>
                     <a:prstGeom prst="rect"/>
                   </pic:spPr>
@@ -13523,7 +13523,7 @@
         <w:pStyle w:val="ListParagraph"/>
         <w:numPr>
           <w:ilvl w:val="0"/>
-          <w:numId w:val="18"/>
+          <w:numId w:val="27"/>
         </w:numPr>
         <w:spacing w:after="60"/>
       </w:pPr>
@@ -13543,7 +13543,7 @@
         <w:pStyle w:val="ListParagraph"/>
         <w:numPr>
           <w:ilvl w:val="0"/>
-          <w:numId w:val="18"/>
+          <w:numId w:val="27"/>
         </w:numPr>
         <w:spacing w:after="60"/>
       </w:pPr>
@@ -13563,7 +13563,7 @@
         <w:pStyle w:val="ListParagraph"/>
         <w:numPr>
           <w:ilvl w:val="0"/>
-          <w:numId w:val="18"/>
+          <w:numId w:val="27"/>
         </w:numPr>
         <w:spacing w:after="60"/>
       </w:pPr>
@@ -13583,7 +13583,7 @@
         <w:pStyle w:val="ListParagraph"/>
         <w:numPr>
           <w:ilvl w:val="0"/>
-          <w:numId w:val="18"/>
+          <w:numId w:val="27"/>
         </w:numPr>
         <w:spacing w:after="60"/>
       </w:pPr>
@@ -13603,7 +13603,7 @@
         <w:pStyle w:val="ListParagraph"/>
         <w:numPr>
           <w:ilvl w:val="0"/>
-          <w:numId w:val="18"/>
+          <w:numId w:val="27"/>
         </w:numPr>
         <w:spacing w:after="60"/>
       </w:pPr>
@@ -13623,7 +13623,7 @@
         <w:pStyle w:val="ListParagraph"/>
         <w:numPr>
           <w:ilvl w:val="0"/>
-          <w:numId w:val="18"/>
+          <w:numId w:val="27"/>
         </w:numPr>
         <w:spacing w:after="60"/>
       </w:pPr>
@@ -13643,7 +13643,7 @@
         <w:pStyle w:val="ListParagraph"/>
         <w:numPr>
           <w:ilvl w:val="0"/>
-          <w:numId w:val="18"/>
+          <w:numId w:val="27"/>
         </w:numPr>
         <w:spacing w:after="60"/>
       </w:pPr>
@@ -13663,7 +13663,7 @@
         <w:pStyle w:val="ListParagraph"/>
         <w:numPr>
           <w:ilvl w:val="0"/>
-          <w:numId w:val="18"/>
+          <w:numId w:val="27"/>
         </w:numPr>
         <w:spacing w:after="60"/>
       </w:pPr>
@@ -13683,7 +13683,7 @@
         <w:pStyle w:val="ListParagraph"/>
         <w:numPr>
           <w:ilvl w:val="0"/>
-          <w:numId w:val="18"/>
+          <w:numId w:val="27"/>
         </w:numPr>
         <w:spacing w:after="60"/>
       </w:pPr>
@@ -13738,7 +13738,7 @@
               <a:graphicData uri="http://schemas.openxmlformats.org/drawingml/2006/picture">
                 <pic:pic>
                   <pic:nvPicPr>
-                    <pic:cNvPr id="0" name="panel10.png"/>
+                    <pic:cNvPr id="0" name="image.png"/>
                     <pic:cNvPicPr/>
                   </pic:nvPicPr>
                   <pic:blipFill>
@@ -13792,7 +13792,7 @@
         <w:pStyle w:val="ListParagraph"/>
         <w:numPr>
           <w:ilvl w:val="0"/>
-          <w:numId w:val="19"/>
+          <w:numId w:val="28"/>
         </w:numPr>
         <w:spacing w:after="60"/>
       </w:pPr>
@@ -13812,7 +13812,7 @@
         <w:pStyle w:val="ListParagraph"/>
         <w:numPr>
           <w:ilvl w:val="0"/>
-          <w:numId w:val="19"/>
+          <w:numId w:val="28"/>
         </w:numPr>
         <w:spacing w:after="60"/>
       </w:pPr>
@@ -13832,7 +13832,7 @@
         <w:pStyle w:val="ListParagraph"/>
         <w:numPr>
           <w:ilvl w:val="0"/>
-          <w:numId w:val="19"/>
+          <w:numId w:val="28"/>
         </w:numPr>
         <w:spacing w:after="60"/>
       </w:pPr>
@@ -13852,7 +13852,7 @@
         <w:pStyle w:val="ListParagraph"/>
         <w:numPr>
           <w:ilvl w:val="0"/>
-          <w:numId w:val="19"/>
+          <w:numId w:val="28"/>
         </w:numPr>
         <w:spacing w:after="60"/>
       </w:pPr>
@@ -13872,7 +13872,7 @@
         <w:pStyle w:val="ListParagraph"/>
         <w:numPr>
           <w:ilvl w:val="0"/>
-          <w:numId w:val="19"/>
+          <w:numId w:val="28"/>
         </w:numPr>
         <w:spacing w:after="60"/>
       </w:pPr>
@@ -19954,6 +19954,66 @@
           </w:p>
         </w:tc>
       </w:tr>
+      <w:tr>
+        <w:tc>
+          <w:tcPr>
+            <w:tcW w:type="dxa" w:w="2991"/>
+            <w:tcBorders>
+              <w:top w:val="single" w:color="C7D0CA" w:sz="4"/>
+              <w:left w:val="single" w:color="C7D0CA" w:sz="4"/>
+              <w:bottom w:val="single" w:color="C7D0CA" w:sz="4"/>
+              <w:right w:val="single" w:color="C7D0CA" w:sz="4"/>
+            </w:tcBorders>
+            <w:tcMar>
+              <w:top w:type="dxa" w:w="60"/>
+              <w:left w:type="dxa" w:w="100"/>
+              <w:bottom w:type="dxa" w:w="60"/>
+              <w:right w:type="dxa" w:w="100"/>
+            </w:tcMar>
+          </w:tcPr>
+          <w:p>
+            <w:pPr>
+              <w:spacing w:after="0"/>
+            </w:pPr>
+            <w:r>
+              <w:rPr>
+                <w:sz w:val="19"/>
+                <w:szCs w:val="19"/>
+              </w:rPr>
+              <w:t xml:space="preserve">job_status</w:t>
+            </w:r>
+          </w:p>
+        </w:tc>
+        <w:tc>
+          <w:tcPr>
+            <w:tcW w:type="dxa" w:w="6647"/>
+            <w:tcBorders>
+              <w:top w:val="single" w:color="C7D0CA" w:sz="4"/>
+              <w:left w:val="single" w:color="C7D0CA" w:sz="4"/>
+              <w:bottom w:val="single" w:color="C7D0CA" w:sz="4"/>
+              <w:right w:val="single" w:color="C7D0CA" w:sz="4"/>
+            </w:tcBorders>
+            <w:tcMar>
+              <w:top w:type="dxa" w:w="60"/>
+              <w:left w:type="dxa" w:w="100"/>
+              <w:bottom w:type="dxa" w:w="60"/>
+              <w:right w:type="dxa" w:w="100"/>
+            </w:tcMar>
+          </w:tcPr>
+          <w:p>
+            <w:pPr>
+              <w:spacing w:after="0"/>
+            </w:pPr>
+            <w:r>
+              <w:rPr>
+                <w:sz w:val="19"/>
+                <w:szCs w:val="19"/>
+              </w:rPr>
+              <w:t xml:space="preserve">When each scheduled job (results_watch, prices) last ran and last did its work, for Settings (migration 0006).</w:t>
+            </w:r>
+          </w:p>
+        </w:tc>
+      </w:tr>
     </w:tbl>
     <w:p>
       <w:pPr>
@@ -20503,7 +20563,7 @@
               <a:graphicData uri="http://schemas.openxmlformats.org/drawingml/2006/picture">
                 <pic:pic>
                   <pic:nvPicPr>
-                    <pic:cNvPr id="0" name="panel11.png"/>
+                    <pic:cNvPr id="0" name="image.png"/>
                     <pic:cNvPicPr/>
                   </pic:nvPicPr>
                   <pic:blipFill>
@@ -23234,7 +23294,7 @@
         <w:t xml:space="preserve">Call recordings.</w:t>
       </w:r>
       <w:r>
-        <w:t xml:space="preserve"> Companies post the call's audio within 24 hours but the transcript only within five working days (SEBI LODR). analekh transcribe-audio turns recordings placed in the import folder into timestamped text locally (Whisper large-v3 through faster-whisper, on the GPU when there is one; optional dependency group audio). Notes are generated from this text first and regenerated from the official transcript once it is filed, so each quarter's call highlights are written once and updated only when a new quarter's results and call arrive.</w:t>
+        <w:t xml:space="preserve"> Companies post the call's audio within 24 hours but the transcript only within five working days (SEBI LODR). analekh transcribe-audio turns recordings placed in the import folder into timestamped text locally (Whisper large-v3 through faster-whisper, on the GPU when there is one; optional dependency group audio). Notes are generated from this text first and regenerated from the official transcript once it is filed, so each quarter's call highlights are written once and updated only when a new quarter's results and call arrive. Future scope (section 26.3): a listener that joins the call as it happens and transcribes it live, marked unverified, until the filed recording replaces it; Workflow 8 in the architecture diagrams shows where it fits.</w:t>
       </w:r>
     </w:p>
     <w:p>
@@ -26670,7 +26730,7 @@
         <w:t xml:space="preserve">Comps:</w:t>
       </w:r>
       <w:r>
-        <w:t xml:space="preserve"> saved peer lists; EV/Sales, EV/EBITDA, P/E, P/B; EV = market cap + debt − cash from the latest balance sheet; trailing twelve months from quarterly facts; fiscal-year alignment; Excel export. Market cap comes from the latest close (section 3.3), so P/E and P/B work; EV-based multiples wait for debt and cash to be sourced.</w:t>
+        <w:t xml:space="preserve"> saved peer lists (up to 30 companies each) and suggested peers (same NSE sector and results format, closest in market cap, the same LSEG group first); price, market cap, TTM revenue, revenue YoY, EBITDA and net margins, P/E and P/B, with median and mean; Excel export. TTM is the last four quarters back to back on one basis (consolidated when four exist, else standalone; the row says which). EBITDA is derived as on the company page and left out for lenders and insurers. Book value is the latest balance sheet's equity attributable to owners (capital plus reserves for banks; not yet for insurers). EV = market cap + debt − cash, shown only once debt and cash are sourced: until then EV multiples are blank, never market cap passed off as EV. A symbol that has left the universe is reported, not fatal.</w:t>
       </w:r>
     </w:p>
     <w:p>
@@ -27524,7 +27584,7 @@
                 <w:sz w:val="19"/>
                 <w:szCs w:val="19"/>
               </w:rPr>
-              <w:t xml:space="preserve">Comps builder</w:t>
+              <w:t xml:space="preserve">Comps</w:t>
             </w:r>
           </w:p>
         </w:tc>
@@ -27553,7 +27613,7 @@
                 <w:sz w:val="19"/>
                 <w:szCs w:val="19"/>
               </w:rPr>
-              <w:t xml:space="preserve">Peer lists, multiples table, export.</w:t>
+              <w:t xml:space="preserve">Saved peer lists (beside the table from 1,500 pixels, a row of buttons above it otherwise); companies added by search or from suggested peers; the table with a basis switch (auto, consolidated, standalone), median and mean rows and an Excel export. The working set lives in the URL. Rows become cards on phones.</w:t>
             </w:r>
           </w:p>
         </w:tc>
@@ -27613,7 +27673,7 @@
                 <w:sz w:val="19"/>
                 <w:szCs w:val="19"/>
               </w:rPr>
-              <w:t xml:space="preserve">Watched folders, alert channels, API keys.</w:t>
+              <w:t xml:space="preserve">Data status (the results watcher's season, last ask and next ask, with a warning when a scheduled start left no record; the latest close and its coverage; stored counts and database size; whether an Anthropic key is set, never the key). Alerts (Telegram and email set up or not, a test message per channel, recent alerts; errors are summarised, never echoed, as they can hold the bot token). Display preferences saved in the browser: theme, amounts (auto, crore or million), the company page's basis and the Results desk order. NSE schedules are not editable: they follow the owner's approvals. Watched folders and save mode come with the Excel bridge.</w:t>
             </w:r>
           </w:p>
         </w:tc>
@@ -27686,7 +27746,7 @@
         <w:spacing w:after="60"/>
       </w:pPr>
       <w:r>
-        <w:t xml:space="preserve">CLI: analekh universe load, analekh universe sectors [--stocks-file], analekh search, analekh watch, analekh refresh, analekh backfill, analekh results-backfill, analekh results-watch, analekh prices, analekh revalidate, analekh recompute-latest, analekh transcribe-audio, analekh template add, analekh build, analekh sync, analekh golden-test.</w:t>
+        <w:t xml:space="preserve">CLI: analekh universe load, analekh universe sectors [--stocks-file], analekh search, analekh watch, analekh refresh, analekh backfill, analekh results-backfill, analekh results-watch, analekh prices, analekh revalidate, analekh recompute-latest, analekh transcribe-audio, analekh template add, analekh build, analekh sync, analekh golden-sheet, analekh golden-import, analekh golden-test.</w:t>
       </w:r>
     </w:p>
     <w:p>
@@ -29397,7 +29457,7 @@
                 <w:sz w:val="19"/>
                 <w:szCs w:val="19"/>
               </w:rPr>
-              <w:t xml:space="preserve">POST /comps</w:t>
+              <w:t xml:space="preserve">GET, POST /peer-lists; PUT, DELETE /peer-lists/{id}</w:t>
             </w:r>
           </w:p>
         </w:tc>
@@ -29426,7 +29486,7 @@
                 <w:sz w:val="19"/>
                 <w:szCs w:val="19"/>
               </w:rPr>
-              <w:t xml:space="preserve">Comps for a peer list.</w:t>
+              <w:t xml:space="preserve">Saved peer lists (names unique ignoring case; symbols checked against the universe).</w:t>
             </w:r>
           </w:p>
         </w:tc>
@@ -29457,7 +29517,7 @@
                 <w:sz w:val="19"/>
                 <w:szCs w:val="19"/>
               </w:rPr>
-              <w:t xml:space="preserve">GET /alerts</w:t>
+              <w:t xml:space="preserve">GET /companies/{symbol}/peers</w:t>
             </w:r>
           </w:p>
         </w:tc>
@@ -29486,7 +29546,187 @@
                 <w:sz w:val="19"/>
                 <w:szCs w:val="19"/>
               </w:rPr>
-              <w:t xml:space="preserve">Recent alerts.</w:t>
+              <w:t xml:space="preserve">Suggested peers.</w:t>
+            </w:r>
+          </w:p>
+        </w:tc>
+      </w:tr>
+      <w:tr>
+        <w:tc>
+          <w:tcPr>
+            <w:tcW w:type="dxa" w:w="4819"/>
+            <w:tcBorders>
+              <w:top w:val="single" w:color="C7D0CA" w:sz="4"/>
+              <w:left w:val="single" w:color="C7D0CA" w:sz="4"/>
+              <w:bottom w:val="single" w:color="C7D0CA" w:sz="4"/>
+              <w:right w:val="single" w:color="C7D0CA" w:sz="4"/>
+            </w:tcBorders>
+            <w:tcMar>
+              <w:top w:type="dxa" w:w="60"/>
+              <w:left w:type="dxa" w:w="100"/>
+              <w:bottom w:type="dxa" w:w="60"/>
+              <w:right w:type="dxa" w:w="100"/>
+            </w:tcMar>
+          </w:tcPr>
+          <w:p>
+            <w:pPr>
+              <w:spacing w:after="0"/>
+            </w:pPr>
+            <w:r>
+              <w:rPr>
+                <w:sz w:val="19"/>
+                <w:szCs w:val="19"/>
+              </w:rPr>
+              <w:t xml:space="preserve">POST /comps/table; POST /comps</w:t>
+            </w:r>
+          </w:p>
+        </w:tc>
+        <w:tc>
+          <w:tcPr>
+            <w:tcW w:type="dxa" w:w="4819"/>
+            <w:tcBorders>
+              <w:top w:val="single" w:color="C7D0CA" w:sz="4"/>
+              <w:left w:val="single" w:color="C7D0CA" w:sz="4"/>
+              <w:bottom w:val="single" w:color="C7D0CA" w:sz="4"/>
+              <w:right w:val="single" w:color="C7D0CA" w:sz="4"/>
+            </w:tcBorders>
+            <w:tcMar>
+              <w:top w:type="dxa" w:w="60"/>
+              <w:left w:type="dxa" w:w="100"/>
+              <w:bottom w:type="dxa" w:w="60"/>
+              <w:right w:type="dxa" w:w="100"/>
+            </w:tcMar>
+          </w:tcPr>
+          <w:p>
+            <w:pPr>
+              <w:spacing w:after="0"/>
+            </w:pPr>
+            <w:r>
+              <w:rPr>
+                <w:sz w:val="19"/>
+                <w:szCs w:val="19"/>
+              </w:rPr>
+              <w:t xml:space="preserve">The comps table as JSON, or as an Excel workbook.</w:t>
+            </w:r>
+          </w:p>
+        </w:tc>
+      </w:tr>
+      <w:tr>
+        <w:tc>
+          <w:tcPr>
+            <w:tcW w:type="dxa" w:w="4819"/>
+            <w:tcBorders>
+              <w:top w:val="single" w:color="C7D0CA" w:sz="4"/>
+              <w:left w:val="single" w:color="C7D0CA" w:sz="4"/>
+              <w:bottom w:val="single" w:color="C7D0CA" w:sz="4"/>
+              <w:right w:val="single" w:color="C7D0CA" w:sz="4"/>
+            </w:tcBorders>
+            <w:tcMar>
+              <w:top w:type="dxa" w:w="60"/>
+              <w:left w:type="dxa" w:w="100"/>
+              <w:bottom w:type="dxa" w:w="60"/>
+              <w:right w:type="dxa" w:w="100"/>
+            </w:tcMar>
+          </w:tcPr>
+          <w:p>
+            <w:pPr>
+              <w:spacing w:after="0"/>
+            </w:pPr>
+            <w:r>
+              <w:rPr>
+                <w:sz w:val="19"/>
+                <w:szCs w:val="19"/>
+              </w:rPr>
+              <w:t xml:space="preserve">GET /status</w:t>
+            </w:r>
+          </w:p>
+        </w:tc>
+        <w:tc>
+          <w:tcPr>
+            <w:tcW w:type="dxa" w:w="4819"/>
+            <w:tcBorders>
+              <w:top w:val="single" w:color="C7D0CA" w:sz="4"/>
+              <w:left w:val="single" w:color="C7D0CA" w:sz="4"/>
+              <w:bottom w:val="single" w:color="C7D0CA" w:sz="4"/>
+              <w:right w:val="single" w:color="C7D0CA" w:sz="4"/>
+            </w:tcBorders>
+            <w:tcMar>
+              <w:top w:type="dxa" w:w="60"/>
+              <w:left w:type="dxa" w:w="100"/>
+              <w:bottom w:type="dxa" w:w="60"/>
+              <w:right w:type="dxa" w:w="100"/>
+            </w:tcMar>
+          </w:tcPr>
+          <w:p>
+            <w:pPr>
+              <w:spacing w:after="0"/>
+            </w:pPr>
+            <w:r>
+              <w:rPr>
+                <w:sz w:val="19"/>
+                <w:szCs w:val="19"/>
+              </w:rPr>
+              <w:t xml:space="preserve">Data status for Settings; reads only, never contacts NSE.</w:t>
+            </w:r>
+          </w:p>
+        </w:tc>
+      </w:tr>
+      <w:tr>
+        <w:tc>
+          <w:tcPr>
+            <w:tcW w:type="dxa" w:w="4819"/>
+            <w:tcBorders>
+              <w:top w:val="single" w:color="C7D0CA" w:sz="4"/>
+              <w:left w:val="single" w:color="C7D0CA" w:sz="4"/>
+              <w:bottom w:val="single" w:color="C7D0CA" w:sz="4"/>
+              <w:right w:val="single" w:color="C7D0CA" w:sz="4"/>
+            </w:tcBorders>
+            <w:tcMar>
+              <w:top w:type="dxa" w:w="60"/>
+              <w:left w:type="dxa" w:w="100"/>
+              <w:bottom w:type="dxa" w:w="60"/>
+              <w:right w:type="dxa" w:w="100"/>
+            </w:tcMar>
+          </w:tcPr>
+          <w:p>
+            <w:pPr>
+              <w:spacing w:after="0"/>
+            </w:pPr>
+            <w:r>
+              <w:rPr>
+                <w:sz w:val="19"/>
+                <w:szCs w:val="19"/>
+              </w:rPr>
+              <w:t xml:space="preserve">GET /alerts/channels; POST /alerts/test; GET /alerts</w:t>
+            </w:r>
+          </w:p>
+        </w:tc>
+        <w:tc>
+          <w:tcPr>
+            <w:tcW w:type="dxa" w:w="4819"/>
+            <w:tcBorders>
+              <w:top w:val="single" w:color="C7D0CA" w:sz="4"/>
+              <w:left w:val="single" w:color="C7D0CA" w:sz="4"/>
+              <w:bottom w:val="single" w:color="C7D0CA" w:sz="4"/>
+              <w:right w:val="single" w:color="C7D0CA" w:sz="4"/>
+            </w:tcBorders>
+            <w:tcMar>
+              <w:top w:type="dxa" w:w="60"/>
+              <w:left w:type="dxa" w:w="100"/>
+              <w:bottom w:type="dxa" w:w="60"/>
+              <w:right w:type="dxa" w:w="100"/>
+            </w:tcMar>
+          </w:tcPr>
+          <w:p>
+            <w:pPr>
+              <w:spacing w:after="0"/>
+            </w:pPr>
+            <w:r>
+              <w:rPr>
+                <w:sz w:val="19"/>
+                <w:szCs w:val="19"/>
+              </w:rPr>
+              <w:t xml:space="preserve">Alert channels set up, a test message, recent alerts.</w:t>
             </w:r>
           </w:p>
         </w:tc>
@@ -33407,7 +33647,7 @@
               <a:graphicData uri="http://schemas.openxmlformats.org/drawingml/2006/picture">
                 <pic:pic>
                   <pic:nvPicPr>
-                    <pic:cNvPr id="0" name="panel12.png"/>
+                    <pic:cNvPr id="0" name="image.png"/>
                     <pic:cNvPicPr/>
                   </pic:nvPicPr>
                   <pic:blipFill>
@@ -33876,7 +34116,7 @@
                 <w:sz w:val="19"/>
                 <w:szCs w:val="19"/>
               </w:rPr>
-              <w:t xml:space="preserve">20 filings across sectors and every results format (Ind-AS standalone and consolidated, bank, NBFC, general insurer, life insurer) with hand-checked values.</w:t>
+              <w:t xml:space="preserve">20 filings across sectors and every results format (Ind-AS standalone and consolidated, bank, NBFC, general insurer, life insurer) with hand-checked values. analekh golden-sheet copies their XBRL from storage and writes a worksheet (each line, Analekh's value, the results PDF link); the analyst marks every line against the PDF; analekh golden-import writes the manifest. Lines are resolved through the element tables, so the mapping is tested, not only the parser. A line Analekh cannot find stays on the sheet for the PDF's figure.</w:t>
             </w:r>
           </w:p>
         </w:tc>
@@ -36735,6 +36975,83 @@
       </w:pPr>
       <w:r>
         <w:t xml:space="preserve">Decisions waiting on the owner: the LSEG-to-NSE sector mapping (28 clear groups, 25 to decide); how banks are presented and calculated (the owner's walkthrough); hosting details (provider, domain, login); investor presentations through NSE's announcements list (section 28); the 250 BSE-only filers (manual import, or a note that NSE has no data); the logo; the Anthropic API key.</w:t>
+      </w:r>
+    </w:p>
+    <w:p>
+      <w:pPr>
+        <w:pStyle w:val="Heading3"/>
+        <w:keepNext/>
+      </w:pPr>
+      <w:r>
+        <w:t xml:space="preserve">26.3 Future scope (after v1)</w:t>
+      </w:r>
+    </w:p>
+    <w:p>
+      <w:pPr>
+        <w:spacing w:after="140"/>
+      </w:pPr>
+      <w:r>
+        <w:t xml:space="preserve">Left out of v1 by the owner's choice, for a later release (the first two need paid data):</w:t>
+      </w:r>
+    </w:p>
+    <w:p>
+      <w:pPr>
+        <w:pStyle w:val="ListParagraph"/>
+        <w:numPr>
+          <w:ilvl w:val="0"/>
+          <w:numId w:val="3"/>
+        </w:numPr>
+        <w:spacing w:after="60"/>
+      </w:pPr>
+      <w:r>
+        <w:rPr>
+          <w:b/>
+          <w:bCs/>
+        </w:rPr>
+        <w:t xml:space="preserve">Live and intraday prices</w:t>
+      </w:r>
+      <w:r>
+        <w:t xml:space="preserve"> through a paid market-data API (Kite Connect or similar), in place of the end-of-day bhavcopy (section 3.3).</w:t>
+      </w:r>
+    </w:p>
+    <w:p>
+      <w:pPr>
+        <w:pStyle w:val="ListParagraph"/>
+        <w:numPr>
+          <w:ilvl w:val="0"/>
+          <w:numId w:val="3"/>
+        </w:numPr>
+        <w:spacing w:after="60"/>
+      </w:pPr>
+      <w:r>
+        <w:rPr>
+          <w:b/>
+          <w:bCs/>
+        </w:rPr>
+        <w:t xml:space="preserve">NSE's finer classification</w:t>
+      </w:r>
+      <w:r>
+        <w:t xml:space="preserve"> (industry and basic industry, such as Gems, Jewellery and Watches under Consumer Durables) for every company. NSE publishes only the 22 sectors in its index lists, and its per-company classification is not open to Analekh (section 4.2); setting thousands by hand is not worth it (owner, 18 October 2026). A licensed data feed would supply it.</w:t>
+      </w:r>
+    </w:p>
+    <w:p>
+      <w:pPr>
+        <w:pStyle w:val="ListParagraph"/>
+        <w:numPr>
+          <w:ilvl w:val="0"/>
+          <w:numId w:val="3"/>
+        </w:numPr>
+        <w:spacing w:after="60"/>
+      </w:pPr>
+      <w:r>
+        <w:rPr>
+          <w:b/>
+          <w:bCs/>
+        </w:rPr>
+        <w:t xml:space="preserve">Live earnings-call listener</w:t>
+      </w:r>
+      <w:r>
+        <w:t xml:space="preserve"> (owner, 20 October 2026): Analekh's own agent that joins a company's earnings call as it happens and transcribes it live, instead of waiting for the recording on NSE (filed within a day). A call record (company, time, link) starts a headless browser a few minutes early; it registers with the analyst's own details (never a made-up identity, never past a captcha or an operator), records the webcast's audio stream with ffmpeg (or a virtual audio device when the page exposes no stream), and the local Whisper (section 11) transcribes 5 to 10 second pieces on the GPU, about 10 seconds behind the speaker. The company page's Call highlights card shows the transcript as it arrives, marked live and unverified; guidance, margin and capex remarks are extracted with their quotes under the grounding check, and XBRL still wins on any figure. The official recording's transcript replaces it once filed. Fixed scripts handle the common webcast hosts, with a browser agent for unknown registration pages; phone-only calls would need a telephony service (paid per minute) and come later. Transcripts stay in the analyst's own database, never republished, per the calls' terms. Open points: finding calls automatically needs NSE's announcements list (a rule 1 decision, as for investor presentations; until then the analyst pastes the link), and the listener needs an always-on machine (section 22.7). First step when picked up: replay an existing call recording as if live, to measure delay and accuracy.</w:t>
       </w:r>
     </w:p>
     <w:p>
@@ -51741,6 +52058,60 @@
     </w:lvlOverride>
   </w:num>
   <w:num w:numId="19">
+    <w:abstractNumId w:val="4"/>
+    <w:lvlOverride w:ilvl="0">
+      <w:startOverride w:val="1"/>
+    </w:lvlOverride>
+  </w:num>
+  <w:num w:numId="20">
+    <w:abstractNumId w:val="4"/>
+    <w:lvlOverride w:ilvl="0">
+      <w:startOverride w:val="1"/>
+    </w:lvlOverride>
+  </w:num>
+  <w:num w:numId="21">
+    <w:abstractNumId w:val="4"/>
+    <w:lvlOverride w:ilvl="0">
+      <w:startOverride w:val="1"/>
+    </w:lvlOverride>
+  </w:num>
+  <w:num w:numId="22">
+    <w:abstractNumId w:val="4"/>
+    <w:lvlOverride w:ilvl="0">
+      <w:startOverride w:val="1"/>
+    </w:lvlOverride>
+  </w:num>
+  <w:num w:numId="23">
+    <w:abstractNumId w:val="4"/>
+    <w:lvlOverride w:ilvl="0">
+      <w:startOverride w:val="1"/>
+    </w:lvlOverride>
+  </w:num>
+  <w:num w:numId="24">
+    <w:abstractNumId w:val="4"/>
+    <w:lvlOverride w:ilvl="0">
+      <w:startOverride w:val="1"/>
+    </w:lvlOverride>
+  </w:num>
+  <w:num w:numId="25">
+    <w:abstractNumId w:val="4"/>
+    <w:lvlOverride w:ilvl="0">
+      <w:startOverride w:val="1"/>
+    </w:lvlOverride>
+  </w:num>
+  <w:num w:numId="26">
+    <w:abstractNumId w:val="4"/>
+    <w:lvlOverride w:ilvl="0">
+      <w:startOverride w:val="1"/>
+    </w:lvlOverride>
+  </w:num>
+  <w:num w:numId="27">
+    <w:abstractNumId w:val="4"/>
+    <w:lvlOverride w:ilvl="0">
+      <w:startOverride w:val="1"/>
+    </w:lvlOverride>
+  </w:num>
+  <w:num w:numId="28">
     <w:abstractNumId w:val="4"/>
     <w:lvlOverride w:ilvl="0">
       <w:startOverride w:val="1"/>

</xml_diff>